<commit_message>
docs: tailor work log for leadership readers; mail sent
Co-Authored-By: Claude Opus 5.5 <noreply@anthropic.com>
Claude-Session: https://claude.ai/code/session_01Ev2GcePRwbwZKfH9HbtDvV
</commit_message>
<xml_diff>
--- a/docs/scrap-highlight/스크랩하이라이트_DS도입_업무일지.docx
+++ b/docs/scrap-highlight/스크랩하이라이트_DS도입_업무일지.docx
@@ -265,7 +265,7 @@
                 <w:sz w:val="19"/>
                 <w:szCs w:val="19"/>
               </w:rPr>
-              <w:t xml:space="preserve">① 지원 요청 — 팀장님(박상권) 명의 메일 최종안 확정, 발송 대기</w:t>
+              <w:t xml:space="preserve">① 지원 요청 — 팀장님 명의 지원 요청 메일 발송(10.27), 회신 대기</w:t>
             </w:r>
           </w:p>
         </w:tc>
@@ -645,7 +645,7 @@
                 <w:sz w:val="19"/>
                 <w:szCs w:val="19"/>
               </w:rPr>
-              <w:t xml:space="preserve">진행 중 (메일 발송 대기)</w:t>
+              <w:t xml:space="preserve">메일 발송 완료 (회신 대기)</w:t>
             </w:r>
           </w:p>
         </w:tc>
@@ -1047,7 +1047,7 @@
                 <w:sz w:val="19"/>
                 <w:szCs w:val="19"/>
               </w:rPr>
-              <w:t xml:space="preserve">팀장님 명의 지원 요청 메일 발송</w:t>
+              <w:t xml:space="preserve">지원 요청 회신 확인 및 AX개발팀 착수 협의</w:t>
             </w:r>
           </w:p>
         </w:tc>
@@ -1079,7 +1079,7 @@
                 <w:sz w:val="19"/>
                 <w:szCs w:val="19"/>
               </w:rPr>
-              <w:t xml:space="preserve">팀장님</w:t>
+              <w:t xml:space="preserve">양진호</w:t>
             </w:r>
           </w:p>
         </w:tc>
@@ -1143,7 +1143,7 @@
                 <w:sz w:val="19"/>
                 <w:szCs w:val="19"/>
               </w:rPr>
-              <w:t xml:space="preserve">발송 대기</w:t>
+              <w:t xml:space="preserve">대기</w:t>
             </w:r>
           </w:p>
         </w:tc>
@@ -2495,7 +2495,7 @@
           <w:sz w:val="20"/>
           <w:szCs w:val="20"/>
         </w:rPr>
-        <w:t xml:space="preserve">- 메일 발송·샘플 전달 지연 시 11월 테스트 착수 불가 → 10월 내 처리</w:t>
+        <w:t xml:space="preserve">- 샘플 전달·개발팀 착수 지연 시 11월 테스트 착수 불가 → 10월 내 처리</w:t>
       </w:r>
     </w:p>
     <w:p>
@@ -2570,7 +2570,7 @@
           <w:sz w:val="20"/>
           <w:szCs w:val="20"/>
         </w:rPr>
-        <w:t xml:space="preserve">최신 날짜가 위. 굵은 제목 아래 원고는 텔레그램에 그대로 복사.</w:t>
+        <w:t xml:space="preserve">최신 날짜가 위.</w:t>
       </w:r>
     </w:p>
     <w:p>
@@ -2600,7 +2600,7 @@
           <w:sz w:val="20"/>
           <w:szCs w:val="20"/>
         </w:rPr>
-        <w:t xml:space="preserve">08:00 계획 보고 — 이한정 [초안 · 10.27 18:00 결과 반영 후 수정]</w:t>
+        <w:t xml:space="preserve">아침 보고 (이한정) — 초안</w:t>
       </w:r>
     </w:p>
     <w:p>
@@ -2769,7 +2769,20 @@
           <w:sz w:val="20"/>
           <w:szCs w:val="20"/>
         </w:rPr>
-        <w:t xml:space="preserve">     [발송 완료 / 발송 예정]</w:t>
+        <w:t xml:space="preserve">     발송 완료 (10.27),</w:t>
+      </w:r>
+    </w:p>
+    <w:p>
+      <w:pPr>
+        <w:spacing w:after="0" w:line="264"/>
+      </w:pPr>
+      <w:r>
+        <w:rPr>
+          <w:rFonts w:ascii="바탕체" w:cs="바탕체" w:eastAsia="바탕체" w:hAnsi="바탕체"/>
+          <w:sz w:val="20"/>
+          <w:szCs w:val="20"/>
+        </w:rPr>
+        <w:t xml:space="preserve">     회신 대기</w:t>
       </w:r>
     </w:p>
     <w:p>
@@ -3273,7 +3286,7 @@
           <w:sz w:val="20"/>
           <w:szCs w:val="20"/>
         </w:rPr>
-        <w:t xml:space="preserve">- 07:43  이태양 프로(DX 과제 담당)로부터 DX 메일 스레드 및 프로그램 사용 선행조건 입수</w:t>
+        <w:t xml:space="preserve">- 이태양 프로(DX 과제 담당)로부터 DX 메일 스레드 및 프로그램 사용 선행조건 입수</w:t>
       </w:r>
     </w:p>
     <w:p>
@@ -3287,7 +3300,7 @@
           <w:sz w:val="20"/>
           <w:szCs w:val="20"/>
         </w:rPr>
-        <w:t xml:space="preserve">- 08:03  정기 보고 (아래 원문)</w:t>
+        <w:t xml:space="preserve">- AX개발팀 김경수 파트장·이근택 프로와 실무 대화방 개설</w:t>
       </w:r>
     </w:p>
     <w:p>
@@ -3301,7 +3314,7 @@
           <w:sz w:val="20"/>
           <w:szCs w:val="20"/>
         </w:rPr>
-        <w:t xml:space="preserve">- 09:11  김기훈 부장 보고 가이드: 오전 = 당일 계획, 오후 = 당일 결과, 둘을 섞지 않기. 08:00 보고는 전날 작성 후 예약 발신</w:t>
+        <w:t xml:space="preserve">- DX 일정 확인: 그룹 권고 일정에 맞춰 11월 테스트, 12월 적용 예정</w:t>
       </w:r>
     </w:p>
     <w:p>
@@ -3315,7 +3328,7 @@
           <w:sz w:val="20"/>
           <w:szCs w:val="20"/>
         </w:rPr>
-        <w:t xml:space="preserve">- 오전  AX개발팀 김경수 파트장·이근택 프로와 실무 대화방 개설 (양진호)</w:t>
+        <w:t xml:space="preserve">- 보고방 텔레그램 전환</w:t>
       </w:r>
     </w:p>
     <w:p>
@@ -3329,49 +3342,7 @@
           <w:sz w:val="20"/>
           <w:szCs w:val="20"/>
         </w:rPr>
-        <w:t xml:space="preserve">- —  DX 일정 확인: 그룹 권고 일정에 맞춰 11월 테스트, 12월 적용 예정</w:t>
-      </w:r>
-    </w:p>
-    <w:p>
-      <w:pPr>
-        <w:spacing w:after="20" w:line="264"/>
-        <w:ind w:left="200" w:hanging="200"/>
-      </w:pPr>
-      <w:r>
-        <w:rPr>
-          <w:rFonts w:ascii="바탕체" w:cs="바탕체" w:eastAsia="바탕체" w:hAnsi="바탕체"/>
-          <w:sz w:val="20"/>
-          <w:szCs w:val="20"/>
-        </w:rPr>
-        <w:t xml:space="preserve">- —  보고방 텔레그램 전환 완료</w:t>
-      </w:r>
-    </w:p>
-    <w:p>
-      <w:pPr>
-        <w:spacing w:after="20" w:line="264"/>
-        <w:ind w:left="200" w:hanging="200"/>
-      </w:pPr>
-      <w:r>
-        <w:rPr>
-          <w:rFonts w:ascii="바탕체" w:cs="바탕체" w:eastAsia="바탕체" w:hAnsi="바탕체"/>
-          <w:sz w:val="20"/>
-          <w:szCs w:val="20"/>
-        </w:rPr>
-        <w:t xml:space="preserve">- —  팀장님 보고용 추진 현황 문서 작성 (스크랩하이라이트_DS도입_추진현황.docx)</w:t>
-      </w:r>
-    </w:p>
-    <w:p>
-      <w:pPr>
-        <w:spacing w:after="20" w:line="264"/>
-        <w:ind w:left="200" w:hanging="200"/>
-      </w:pPr>
-      <w:r>
-        <w:rPr>
-          <w:rFonts w:ascii="바탕체" w:cs="바탕체" w:eastAsia="바탕체" w:hAnsi="바탕체"/>
-          <w:sz w:val="20"/>
-          <w:szCs w:val="20"/>
-        </w:rPr>
-        <w:t xml:space="preserve">- —  팀장님 명의 지원 요청 메일 최종안 확정 (공손한 톤, 12월 초 적용 목표 명시) → 참고 3.2</w:t>
+        <w:t xml:space="preserve">- 팀장님 명의 지원 요청 메일 발송 (안재용 센터장·김상하 상무, 12월 초 적용 목표)</w:t>
       </w:r>
     </w:p>
     <w:p>
@@ -3391,7 +3362,7 @@
           <w:sz w:val="20"/>
           <w:szCs w:val="20"/>
         </w:rPr>
-        <w:t xml:space="preserve">18:00 결과 보고 — 양진호 [초안 · [ ] 채울 것]</w:t>
+        <w:t xml:space="preserve">저녁 보고 (양진호) — 초안</w:t>
       </w:r>
     </w:p>
     <w:p>
@@ -3495,7 +3466,7 @@
           <w:sz w:val="20"/>
           <w:szCs w:val="20"/>
         </w:rPr>
-        <w:t xml:space="preserve">     — [완료 / 진행 중]</w:t>
+        <w:t xml:space="preserve">     — 완료</w:t>
       </w:r>
     </w:p>
     <w:p>
@@ -3521,33 +3492,33 @@
           <w:sz w:val="20"/>
           <w:szCs w:val="20"/>
         </w:rPr>
-        <w:t xml:space="preserve"> - 지원 요청 메일 최종안 작성,</w:t>
-      </w:r>
-    </w:p>
-    <w:p>
-      <w:pPr>
-        <w:spacing w:after="0" w:line="264"/>
-      </w:pPr>
-      <w:r>
-        <w:rPr>
-          <w:rFonts w:ascii="바탕체" w:cs="바탕체" w:eastAsia="바탕체" w:hAnsi="바탕체"/>
-          <w:sz w:val="20"/>
-          <w:szCs w:val="20"/>
-        </w:rPr>
-        <w:t xml:space="preserve">     팀장님 보고 완료</w:t>
-      </w:r>
-    </w:p>
-    <w:p>
-      <w:pPr>
-        <w:spacing w:after="0" w:line="264"/>
-      </w:pPr>
-      <w:r>
-        <w:rPr>
-          <w:rFonts w:ascii="바탕체" w:cs="바탕체" w:eastAsia="바탕체" w:hAnsi="바탕체"/>
-          <w:sz w:val="20"/>
-          <w:szCs w:val="20"/>
-        </w:rPr>
-        <w:t xml:space="preserve">     [발송 여부]</w:t>
+        <w:t xml:space="preserve"> - 팀장님 명의 지원 요청 메일</w:t>
+      </w:r>
+    </w:p>
+    <w:p>
+      <w:pPr>
+        <w:spacing w:after="0" w:line="264"/>
+      </w:pPr>
+      <w:r>
+        <w:rPr>
+          <w:rFonts w:ascii="바탕체" w:cs="바탕체" w:eastAsia="바탕체" w:hAnsi="바탕체"/>
+          <w:sz w:val="20"/>
+          <w:szCs w:val="20"/>
+        </w:rPr>
+        <w:t xml:space="preserve">     발송 완료 (안재용 센터장·</w:t>
+      </w:r>
+    </w:p>
+    <w:p>
+      <w:pPr>
+        <w:spacing w:after="0" w:line="264"/>
+      </w:pPr>
+      <w:r>
+        <w:rPr>
+          <w:rFonts w:ascii="바탕체" w:cs="바탕체" w:eastAsia="바탕체" w:hAnsi="바탕체"/>
+          <w:sz w:val="20"/>
+          <w:szCs w:val="20"/>
+        </w:rPr>
+        <w:t xml:space="preserve">     김상하 상무)</w:t>
       </w:r>
     </w:p>
     <w:p>
@@ -4014,7 +3985,7 @@
           <w:sz w:val="20"/>
           <w:szCs w:val="20"/>
         </w:rPr>
-        <w:t xml:space="preserve">08:03 정기 보고 — 이한정 [발송 원문]</w:t>
+        <w:t xml:space="preserve">아침 보고 (이한정)</w:t>
       </w:r>
     </w:p>
     <w:p>
@@ -5194,7 +5165,7 @@
           <w:sz w:val="20"/>
           <w:szCs w:val="20"/>
         </w:rPr>
-        <w:t xml:space="preserve">- 오후  팀장님 → 이한정 전화: "전사 AX 과제 왜 안 하고 있어?"</w:t>
+        <w:t xml:space="preserve">- 담당 지정 (양진호·이한정), 보고방 개설</w:t>
       </w:r>
     </w:p>
     <w:p>
@@ -5208,7 +5179,7 @@
           <w:sz w:val="20"/>
           <w:szCs w:val="20"/>
         </w:rPr>
-        <w:t xml:space="preserve">- 17:11  김인철 상무: DS만 피드백 없음 지적</w:t>
+        <w:t xml:space="preserve">- 김용호 프로(전자 PR기획그룹) 통화, 그룹 안내 메일 재수령</w:t>
       </w:r>
     </w:p>
     <w:p>
@@ -5222,7 +5193,7 @@
           <w:sz w:val="20"/>
           <w:szCs w:val="20"/>
         </w:rPr>
-        <w:t xml:space="preserve">- 17:14  담당 지정 — 양진호·이한정. 당일 김용호 프로 연락 지시</w:t>
+        <w:t xml:space="preserve">- DX는 AX개발팀과 도입 진행 중이며, DS도 개발팀에 직접 지원 요청 가능 확인</w:t>
       </w:r>
     </w:p>
     <w:p>
@@ -5236,105 +5207,7 @@
           <w:sz w:val="20"/>
           <w:szCs w:val="20"/>
         </w:rPr>
-        <w:t xml:space="preserve">- 17:18  이정섭 파트장 보고방 개설</w:t>
-      </w:r>
-    </w:p>
-    <w:p>
-      <w:pPr>
-        <w:spacing w:after="20" w:line="264"/>
-        <w:ind w:left="200" w:hanging="200"/>
-      </w:pPr>
-      <w:r>
-        <w:rPr>
-          <w:rFonts w:ascii="바탕체" w:cs="바탕체" w:eastAsia="바탕체" w:hAnsi="바탕체"/>
-          <w:sz w:val="20"/>
-          <w:szCs w:val="20"/>
-        </w:rPr>
-        <w:t xml:space="preserve">- 17:24  이한정, 김용호 프로(전자 PR기획그룹) 통화 → 임원 대상 안내 메일 재수령</w:t>
-      </w:r>
-    </w:p>
-    <w:p>
-      <w:pPr>
-        <w:spacing w:after="20" w:line="264"/>
-        <w:ind w:left="200" w:hanging="200"/>
-      </w:pPr>
-      <w:r>
-        <w:rPr>
-          <w:rFonts w:ascii="바탕체" w:cs="바탕체" w:eastAsia="바탕체" w:hAnsi="바탕체"/>
-          <w:sz w:val="20"/>
-          <w:szCs w:val="20"/>
-        </w:rPr>
-        <w:t xml:space="preserve">- 17:38  1차 보고: DX는 AX개발팀과 진행 중, DS도 직접 지원 요청 가능, DS 양식 맞춤 개발·테스트 필요</w:t>
-      </w:r>
-    </w:p>
-    <w:p>
-      <w:pPr>
-        <w:spacing w:after="20" w:line="264"/>
-        <w:ind w:left="200" w:hanging="200"/>
-      </w:pPr>
-      <w:r>
-        <w:rPr>
-          <w:rFonts w:ascii="바탕체" w:cs="바탕체" w:eastAsia="바탕체" w:hAnsi="바탕체"/>
-          <w:sz w:val="20"/>
-          <w:szCs w:val="20"/>
-        </w:rPr>
-        <w:t xml:space="preserve">- 17:44  김인철 상무: DX와 가능하면 동일 시점 도입</w:t>
-      </w:r>
-    </w:p>
-    <w:p>
-      <w:pPr>
-        <w:spacing w:after="20" w:line="264"/>
-        <w:ind w:left="200" w:hanging="200"/>
-      </w:pPr>
-      <w:r>
-        <w:rPr>
-          <w:rFonts w:ascii="바탕체" w:cs="바탕체" w:eastAsia="바탕체" w:hAnsi="바탕체"/>
-          <w:sz w:val="20"/>
-          <w:szCs w:val="20"/>
-        </w:rPr>
-        <w:t xml:space="preserve">- 17:45  보고 루틴 지시 (08:00 이한정 / 18:00 양진호), 텔레그램 전환 지시</w:t>
-      </w:r>
-    </w:p>
-    <w:p>
-      <w:pPr>
-        <w:spacing w:after="20" w:line="264"/>
-        <w:ind w:left="200" w:hanging="200"/>
-      </w:pPr>
-      <w:r>
-        <w:rPr>
-          <w:rFonts w:ascii="바탕체" w:cs="바탕체" w:eastAsia="바탕체" w:hAnsi="바탕체"/>
-          <w:sz w:val="20"/>
-          <w:szCs w:val="20"/>
-        </w:rPr>
-        <w:t xml:space="preserve">- 17:46  박상권 팀장: 차병석 부사장이 백사장님께 각 사별 진행상황 통합 보고 예정</w:t>
-      </w:r>
-    </w:p>
-    <w:p>
-      <w:pPr>
-        <w:spacing w:after="20" w:line="264"/>
-        <w:ind w:left="200" w:hanging="200"/>
-      </w:pPr>
-      <w:r>
-        <w:rPr>
-          <w:rFonts w:ascii="바탕체" w:cs="바탕체" w:eastAsia="바탕체" w:hAnsi="바탕체"/>
-          <w:sz w:val="20"/>
-          <w:szCs w:val="20"/>
-        </w:rPr>
-        <w:t xml:space="preserve">- 17:46  김기훈 부장: 김용호 프로 측 설명 담당</w:t>
-      </w:r>
-    </w:p>
-    <w:p>
-      <w:pPr>
-        <w:spacing w:after="20" w:line="264"/>
-        <w:ind w:left="200" w:hanging="200"/>
-      </w:pPr>
-      <w:r>
-        <w:rPr>
-          <w:rFonts w:ascii="바탕체" w:cs="바탕체" w:eastAsia="바탕체" w:hAnsi="바탕체"/>
-          <w:sz w:val="20"/>
-          <w:szCs w:val="20"/>
-        </w:rPr>
-        <w:t xml:space="preserve">- 17:49  김인철 상무: 필요하면 전화 말고 직접 찾아가 만날 것</w:t>
+        <w:t xml:space="preserve">- 기존 프로그램은 그룹 양식 기준 → DS 양식 적용 테스트 필요</w:t>
       </w:r>
     </w:p>
     <w:p>
@@ -5363,7 +5236,7 @@
           <w:sz w:val="20"/>
           <w:szCs w:val="20"/>
         </w:rPr>
-        <w:t xml:space="preserve">- 10.06  홍보임원회의에서 'AI 활용 스크랩 하이라이트' 언급</w:t>
+        <w:t xml:space="preserve">- 10.06 홍보임원회의에서 'AI 활용 스크랩 하이라이트' 언급</w:t>
       </w:r>
     </w:p>
     <w:p>
@@ -5377,7 +5250,7 @@
           <w:sz w:val="20"/>
           <w:szCs w:val="20"/>
         </w:rPr>
-        <w:t xml:space="preserve">- 10.12  DX 정홍욱 상무 → AX개발팀 적용 요청·샘플 전달, 당일 "그룹과 유사, 적용 가능" 회신</w:t>
+        <w:t xml:space="preserve">- 10.12 DX 정홍욱 상무 → AX개발팀 적용 요청·샘플 전달, 당일 "그룹과 유사, 적용 가능" 회신</w:t>
       </w:r>
     </w:p>
     <w:p>
@@ -5391,7 +5264,7 @@
           <w:sz w:val="20"/>
           <w:szCs w:val="20"/>
         </w:rPr>
-        <w:t xml:space="preserve">- 10.12  차병석 부사장 관계사 안내 메일 (권고: 10월 착수 → 11월 테스트 → 12월 적용)</w:t>
+        <w:t xml:space="preserve">- 10.12 차병석 부사장 관계사 안내 메일 (권고: 10월 착수 → 11월 테스트 → 12월 적용)</w:t>
       </w:r>
     </w:p>
     <w:p>
@@ -5405,21 +5278,7 @@
           <w:sz w:val="20"/>
           <w:szCs w:val="20"/>
         </w:rPr>
-        <w:t xml:space="preserve">- 10.13  DX 특수 편집 기사 추가 학습 불필요 결정</w:t>
-      </w:r>
-    </w:p>
-    <w:p>
-      <w:pPr>
-        <w:spacing w:after="20" w:line="264"/>
-        <w:ind w:left="200" w:hanging="200"/>
-      </w:pPr>
-      <w:r>
-        <w:rPr>
-          <w:rFonts w:ascii="바탕체" w:cs="바탕체" w:eastAsia="바탕체" w:hAnsi="바탕체"/>
-          <w:sz w:val="20"/>
-          <w:szCs w:val="20"/>
-        </w:rPr>
-        <w:t xml:space="preserve">- 10.13  김인철 상무 FW ("양진호·이한정에게 맡길 요량") — 이한정 수신 누락, 별도 지시 없어 미착수</w:t>
+        <w:t xml:space="preserve">- 10.13 DX 특수 편집 기사 추가 학습 불필요 결정</w:t>
       </w:r>
     </w:p>
     <w:p>
@@ -5454,870 +5313,7 @@
           <w:sz w:val="22"/>
           <w:szCs w:val="22"/>
         </w:rPr>
-        <w:t xml:space="preserve">3.1 보고 원칙</w:t>
-      </w:r>
-    </w:p>
-    <w:tbl>
-      <w:tblPr>
-        <w:tblW w:type="dxa" w:w="9026"/>
-        <w:tblBorders>
-          <w:top w:val="single" w:color="auto" w:sz="4"/>
-          <w:left w:val="single" w:color="auto" w:sz="4"/>
-          <w:bottom w:val="single" w:color="auto" w:sz="4"/>
-          <w:right w:val="single" w:color="auto" w:sz="4"/>
-          <w:insideH w:val="single" w:color="auto" w:sz="4"/>
-          <w:insideV w:val="single" w:color="auto" w:sz="4"/>
-        </w:tblBorders>
-      </w:tblPr>
-      <w:tblGrid>
-        <w:gridCol w:w="1500"/>
-        <w:gridCol w:w="7526"/>
-      </w:tblGrid>
-      <w:tr>
-        <w:trPr>
-          <w:tblHeader/>
-        </w:trPr>
-        <w:tc>
-          <w:tcPr>
-            <w:tcW w:type="dxa" w:w="1500"/>
-            <w:tcBorders>
-              <w:top w:val="single" w:color="000000" w:sz="4"/>
-              <w:left w:val="single" w:color="000000" w:sz="4"/>
-              <w:bottom w:val="single" w:color="000000" w:sz="4"/>
-              <w:right w:val="single" w:color="000000" w:sz="4"/>
-            </w:tcBorders>
-            <w:tcMar>
-              <w:top w:type="dxa" w:w="30"/>
-              <w:left w:type="dxa" w:w="80"/>
-              <w:bottom w:type="dxa" w:w="30"/>
-              <w:right w:type="dxa" w:w="80"/>
-            </w:tcMar>
-          </w:tcPr>
-          <w:p>
-            <w:pPr>
-              <w:spacing w:after="0" w:line="250"/>
-              <w:jc w:val="center"/>
-            </w:pPr>
-            <w:r>
-              <w:rPr>
-                <w:rFonts w:ascii="바탕체" w:cs="바탕체" w:eastAsia="바탕체" w:hAnsi="바탕체"/>
-                <w:b/>
-                <w:bCs/>
-                <w:sz w:val="19"/>
-                <w:szCs w:val="19"/>
-              </w:rPr>
-              <w:t xml:space="preserve">구분</w:t>
-            </w:r>
-          </w:p>
-        </w:tc>
-        <w:tc>
-          <w:tcPr>
-            <w:tcW w:type="dxa" w:w="7526"/>
-            <w:tcBorders>
-              <w:top w:val="single" w:color="000000" w:sz="4"/>
-              <w:left w:val="single" w:color="000000" w:sz="4"/>
-              <w:bottom w:val="single" w:color="000000" w:sz="4"/>
-              <w:right w:val="single" w:color="000000" w:sz="4"/>
-            </w:tcBorders>
-            <w:tcMar>
-              <w:top w:type="dxa" w:w="30"/>
-              <w:left w:type="dxa" w:w="80"/>
-              <w:bottom w:type="dxa" w:w="30"/>
-              <w:right w:type="dxa" w:w="80"/>
-            </w:tcMar>
-          </w:tcPr>
-          <w:p>
-            <w:pPr>
-              <w:spacing w:after="0" w:line="250"/>
-              <w:jc w:val="center"/>
-            </w:pPr>
-            <w:r>
-              <w:rPr>
-                <w:rFonts w:ascii="바탕체" w:cs="바탕체" w:eastAsia="바탕체" w:hAnsi="바탕체"/>
-                <w:b/>
-                <w:bCs/>
-                <w:sz w:val="19"/>
-                <w:szCs w:val="19"/>
-              </w:rPr>
-              <w:t xml:space="preserve">내용</w:t>
-            </w:r>
-          </w:p>
-        </w:tc>
-      </w:tr>
-      <w:tr>
-        <w:trPr>
-          <w:cantSplit/>
-        </w:trPr>
-        <w:tc>
-          <w:tcPr>
-            <w:tcW w:type="dxa" w:w="1500"/>
-            <w:tcBorders>
-              <w:top w:val="single" w:color="000000" w:sz="4"/>
-              <w:left w:val="single" w:color="000000" w:sz="4"/>
-              <w:bottom w:val="single" w:color="000000" w:sz="4"/>
-              <w:right w:val="single" w:color="000000" w:sz="4"/>
-            </w:tcBorders>
-            <w:tcMar>
-              <w:top w:type="dxa" w:w="30"/>
-              <w:left w:type="dxa" w:w="80"/>
-              <w:bottom w:type="dxa" w:w="30"/>
-              <w:right w:type="dxa" w:w="80"/>
-            </w:tcMar>
-          </w:tcPr>
-          <w:p>
-            <w:pPr>
-              <w:spacing w:after="0" w:line="250"/>
-            </w:pPr>
-            <w:r>
-              <w:rPr>
-                <w:rFonts w:ascii="바탕체" w:cs="바탕체" w:eastAsia="바탕체" w:hAnsi="바탕체"/>
-                <w:b w:val="false"/>
-                <w:bCs w:val="false"/>
-                <w:sz w:val="19"/>
-                <w:szCs w:val="19"/>
-              </w:rPr>
-              <w:t xml:space="preserve">08:00 계획</w:t>
-            </w:r>
-          </w:p>
-        </w:tc>
-        <w:tc>
-          <w:tcPr>
-            <w:tcW w:type="dxa" w:w="7526"/>
-            <w:tcBorders>
-              <w:top w:val="single" w:color="000000" w:sz="4"/>
-              <w:left w:val="single" w:color="000000" w:sz="4"/>
-              <w:bottom w:val="single" w:color="000000" w:sz="4"/>
-              <w:right w:val="single" w:color="000000" w:sz="4"/>
-            </w:tcBorders>
-            <w:tcMar>
-              <w:top w:type="dxa" w:w="30"/>
-              <w:left w:type="dxa" w:w="80"/>
-              <w:bottom w:type="dxa" w:w="30"/>
-              <w:right w:type="dxa" w:w="80"/>
-            </w:tcMar>
-          </w:tcPr>
-          <w:p>
-            <w:pPr>
-              <w:spacing w:after="0" w:line="250"/>
-            </w:pPr>
-            <w:r>
-              <w:rPr>
-                <w:rFonts w:ascii="바탕체" w:cs="바탕체" w:eastAsia="바탕체" w:hAnsi="바탕체"/>
-                <w:b w:val="false"/>
-                <w:bCs w:val="false"/>
-                <w:sz w:val="19"/>
-                <w:szCs w:val="19"/>
-              </w:rPr>
-              <w:t xml:space="preserve">현재 단계 / 오늘 할 일(①②③, 담당) / 이슈 — 전날 퇴근 전 작성, 예약 발신</w:t>
-            </w:r>
-          </w:p>
-        </w:tc>
-      </w:tr>
-      <w:tr>
-        <w:trPr>
-          <w:cantSplit/>
-        </w:trPr>
-        <w:tc>
-          <w:tcPr>
-            <w:tcW w:type="dxa" w:w="1500"/>
-            <w:tcBorders>
-              <w:top w:val="single" w:color="000000" w:sz="4"/>
-              <w:left w:val="single" w:color="000000" w:sz="4"/>
-              <w:bottom w:val="single" w:color="000000" w:sz="4"/>
-              <w:right w:val="single" w:color="000000" w:sz="4"/>
-            </w:tcBorders>
-            <w:tcMar>
-              <w:top w:type="dxa" w:w="30"/>
-              <w:left w:type="dxa" w:w="80"/>
-              <w:bottom w:type="dxa" w:w="30"/>
-              <w:right w:type="dxa" w:w="80"/>
-            </w:tcMar>
-          </w:tcPr>
-          <w:p>
-            <w:pPr>
-              <w:spacing w:after="0" w:line="250"/>
-            </w:pPr>
-            <w:r>
-              <w:rPr>
-                <w:rFonts w:ascii="바탕체" w:cs="바탕체" w:eastAsia="바탕체" w:hAnsi="바탕체"/>
-                <w:b w:val="false"/>
-                <w:bCs w:val="false"/>
-                <w:sz w:val="19"/>
-                <w:szCs w:val="19"/>
-              </w:rPr>
-              <w:t xml:space="preserve">18:00 결과</w:t>
-            </w:r>
-          </w:p>
-        </w:tc>
-        <w:tc>
-          <w:tcPr>
-            <w:tcW w:type="dxa" w:w="7526"/>
-            <w:tcBorders>
-              <w:top w:val="single" w:color="000000" w:sz="4"/>
-              <w:left w:val="single" w:color="000000" w:sz="4"/>
-              <w:bottom w:val="single" w:color="000000" w:sz="4"/>
-              <w:right w:val="single" w:color="000000" w:sz="4"/>
-            </w:tcBorders>
-            <w:tcMar>
-              <w:top w:type="dxa" w:w="30"/>
-              <w:left w:type="dxa" w:w="80"/>
-              <w:bottom w:type="dxa" w:w="30"/>
-              <w:right w:type="dxa" w:w="80"/>
-            </w:tcMar>
-          </w:tcPr>
-          <w:p>
-            <w:pPr>
-              <w:spacing w:after="0" w:line="250"/>
-            </w:pPr>
-            <w:r>
-              <w:rPr>
-                <w:rFonts w:ascii="바탕체" w:cs="바탕체" w:eastAsia="바탕체" w:hAnsi="바탕체"/>
-                <w:b w:val="false"/>
-                <w:bCs w:val="false"/>
-                <w:sz w:val="19"/>
-                <w:szCs w:val="19"/>
-              </w:rPr>
-              <w:t xml:space="preserve">아침 ①②③ 항목별 완료·진행 중·지연(사유·조치) / 추가 진척</w:t>
-            </w:r>
-          </w:p>
-        </w:tc>
-      </w:tr>
-      <w:tr>
-        <w:trPr>
-          <w:cantSplit/>
-        </w:trPr>
-        <w:tc>
-          <w:tcPr>
-            <w:tcW w:type="dxa" w:w="1500"/>
-            <w:tcBorders>
-              <w:top w:val="single" w:color="000000" w:sz="4"/>
-              <w:left w:val="single" w:color="000000" w:sz="4"/>
-              <w:bottom w:val="single" w:color="000000" w:sz="4"/>
-              <w:right w:val="single" w:color="000000" w:sz="4"/>
-            </w:tcBorders>
-            <w:tcMar>
-              <w:top w:type="dxa" w:w="30"/>
-              <w:left w:type="dxa" w:w="80"/>
-              <w:bottom w:type="dxa" w:w="30"/>
-              <w:right w:type="dxa" w:w="80"/>
-            </w:tcMar>
-          </w:tcPr>
-          <w:p>
-            <w:pPr>
-              <w:spacing w:after="0" w:line="250"/>
-            </w:pPr>
-            <w:r>
-              <w:rPr>
-                <w:rFonts w:ascii="바탕체" w:cs="바탕체" w:eastAsia="바탕체" w:hAnsi="바탕체"/>
-                <w:b w:val="false"/>
-                <w:bCs w:val="false"/>
-                <w:sz w:val="19"/>
-                <w:szCs w:val="19"/>
-              </w:rPr>
-              <w:t xml:space="preserve">원칙</w:t>
-            </w:r>
-          </w:p>
-        </w:tc>
-        <w:tc>
-          <w:tcPr>
-            <w:tcW w:type="dxa" w:w="7526"/>
-            <w:tcBorders>
-              <w:top w:val="single" w:color="000000" w:sz="4"/>
-              <w:left w:val="single" w:color="000000" w:sz="4"/>
-              <w:bottom w:val="single" w:color="000000" w:sz="4"/>
-              <w:right w:val="single" w:color="000000" w:sz="4"/>
-            </w:tcBorders>
-            <w:tcMar>
-              <w:top w:type="dxa" w:w="30"/>
-              <w:left w:type="dxa" w:w="80"/>
-              <w:bottom w:type="dxa" w:w="30"/>
-              <w:right w:type="dxa" w:w="80"/>
-            </w:tcMar>
-          </w:tcPr>
-          <w:p>
-            <w:pPr>
-              <w:spacing w:after="0" w:line="250"/>
-            </w:pPr>
-            <w:r>
-              <w:rPr>
-                <w:rFonts w:ascii="바탕체" w:cs="바탕체" w:eastAsia="바탕체" w:hAnsi="바탕체"/>
-                <w:b w:val="false"/>
-                <w:bCs w:val="false"/>
-                <w:sz w:val="19"/>
-                <w:szCs w:val="19"/>
-              </w:rPr>
-              <w:t xml:space="preserve">계획과 결과를 섞지 않기, 아침·저녁 번호 1:1 대응. 퇴근 전 두 사람이 다음날 계획 합의</w:t>
-            </w:r>
-          </w:p>
-        </w:tc>
-      </w:tr>
-      <w:tr>
-        <w:trPr>
-          <w:cantSplit/>
-        </w:trPr>
-        <w:tc>
-          <w:tcPr>
-            <w:tcW w:type="dxa" w:w="1500"/>
-            <w:tcBorders>
-              <w:top w:val="single" w:color="000000" w:sz="4"/>
-              <w:left w:val="single" w:color="000000" w:sz="4"/>
-              <w:bottom w:val="single" w:color="000000" w:sz="4"/>
-              <w:right w:val="single" w:color="000000" w:sz="4"/>
-            </w:tcBorders>
-            <w:tcMar>
-              <w:top w:type="dxa" w:w="30"/>
-              <w:left w:type="dxa" w:w="80"/>
-              <w:bottom w:type="dxa" w:w="30"/>
-              <w:right w:type="dxa" w:w="80"/>
-            </w:tcMar>
-          </w:tcPr>
-          <w:p>
-            <w:pPr>
-              <w:spacing w:after="0" w:line="250"/>
-            </w:pPr>
-            <w:r>
-              <w:rPr>
-                <w:rFonts w:ascii="바탕체" w:cs="바탕체" w:eastAsia="바탕체" w:hAnsi="바탕체"/>
-                <w:b w:val="false"/>
-                <w:bCs w:val="false"/>
-                <w:sz w:val="19"/>
-                <w:szCs w:val="19"/>
-              </w:rPr>
-              <w:t xml:space="preserve">띄어쓰기</w:t>
-            </w:r>
-          </w:p>
-        </w:tc>
-        <w:tc>
-          <w:tcPr>
-            <w:tcW w:type="dxa" w:w="7526"/>
-            <w:tcBorders>
-              <w:top w:val="single" w:color="000000" w:sz="4"/>
-              <w:left w:val="single" w:color="000000" w:sz="4"/>
-              <w:bottom w:val="single" w:color="000000" w:sz="4"/>
-              <w:right w:val="single" w:color="000000" w:sz="4"/>
-            </w:tcBorders>
-            <w:tcMar>
-              <w:top w:type="dxa" w:w="30"/>
-              <w:left w:type="dxa" w:w="80"/>
-              <w:bottom w:type="dxa" w:w="30"/>
-              <w:right w:type="dxa" w:w="80"/>
-            </w:tcMar>
-          </w:tcPr>
-          <w:p>
-            <w:pPr>
-              <w:spacing w:after="0" w:line="250"/>
-            </w:pPr>
-            <w:r>
-              <w:rPr>
-                <w:rFonts w:ascii="바탕체" w:cs="바탕체" w:eastAsia="바탕체" w:hAnsi="바탕체"/>
-                <w:b w:val="false"/>
-                <w:bCs w:val="false"/>
-                <w:sz w:val="19"/>
-                <w:szCs w:val="19"/>
-              </w:rPr>
-              <w:t xml:space="preserve">□ 줄: 공백 없이 시작, 다음 줄부터 공백 5칸</w:t>
-            </w:r>
-          </w:p>
-          <w:p>
-            <w:pPr>
-              <w:spacing w:after="0" w:line="250"/>
-            </w:pPr>
-            <w:r>
-              <w:rPr>
-                <w:rFonts w:ascii="바탕체" w:cs="바탕체" w:eastAsia="바탕체" w:hAnsi="바탕체"/>
-                <w:b w:val="false"/>
-                <w:bCs w:val="false"/>
-                <w:sz w:val="19"/>
-                <w:szCs w:val="19"/>
-              </w:rPr>
-              <w:t xml:space="preserve">- 줄: 앞에 공백 1칸, 다음 줄부터 공백 5칸</w:t>
-            </w:r>
-          </w:p>
-        </w:tc>
-      </w:tr>
-    </w:tbl>
-    <w:p>
-      <w:pPr>
-        <w:spacing w:after="40" w:before="140"/>
-      </w:pPr>
-      <w:r>
-        <w:rPr>
-          <w:rFonts w:ascii="바탕체" w:cs="바탕체" w:eastAsia="바탕체" w:hAnsi="바탕체"/>
-          <w:b/>
-          <w:bCs/>
-          <w:sz w:val="20"/>
-          <w:szCs w:val="20"/>
-        </w:rPr>
-        <w:t xml:space="preserve">일지 쓰는 법</w:t>
-      </w:r>
-    </w:p>
-    <w:p>
-      <w:pPr>
-        <w:spacing w:after="20" w:line="264"/>
-        <w:ind w:left="200" w:hanging="200"/>
-      </w:pPr>
-      <w:r>
-        <w:rPr>
-          <w:rFonts w:ascii="바탕체" w:cs="바탕체" w:eastAsia="바탕체" w:hAnsi="바탕체"/>
-          <w:sz w:val="20"/>
-          <w:szCs w:val="20"/>
-        </w:rPr>
-        <w:t xml:space="preserve">- 매일 맨 위에 새 날짜 블록 추가 → 08:00 원고·18:00 원고·주요 사항</w:t>
-      </w:r>
-    </w:p>
-    <w:p>
-      <w:pPr>
-        <w:spacing w:after="20" w:line="264"/>
-        <w:ind w:left="200" w:hanging="200"/>
-      </w:pPr>
-      <w:r>
-        <w:rPr>
-          <w:rFonts w:ascii="바탕체" w:cs="바탕체" w:eastAsia="바탕체" w:hAnsi="바탕체"/>
-          <w:sz w:val="20"/>
-          <w:szCs w:val="20"/>
-        </w:rPr>
-        <w:t xml:space="preserve">- 18:00 보고 후 현황판(현재 단계·미결 과제) 갱신, 끝난 과제는 현황판에서 지우고 일지에 기록</w:t>
-      </w:r>
-    </w:p>
-    <w:p>
-      <w:pPr>
-        <w:spacing w:after="20" w:line="264"/>
-        <w:ind w:left="200" w:hanging="200"/>
-      </w:pPr>
-      <w:r>
-        <w:rPr>
-          <w:rFonts w:ascii="바탕체" w:cs="바탕체" w:eastAsia="바탕체" w:hAnsi="바탕체"/>
-          <w:sz w:val="20"/>
-          <w:szCs w:val="20"/>
-        </w:rPr>
-        <w:t xml:space="preserve">- 텔레그램에 올린 뒤 원고 제목의 '초안'을 '발송 원문'으로 변경</w:t>
-      </w:r>
-    </w:p>
-    <w:p>
-      <w:pPr>
-        <w:spacing w:after="80" w:before="240"/>
-      </w:pPr>
-      <w:r>
-        <w:rPr>
-          <w:rFonts w:ascii="바탕체" w:cs="바탕체" w:eastAsia="바탕체" w:hAnsi="바탕체"/>
-          <w:b/>
-          <w:bCs/>
-          <w:sz w:val="22"/>
-          <w:szCs w:val="22"/>
-        </w:rPr>
-        <w:t xml:space="preserve">3.2 지원 요청 메일 (최종안)</w:t>
-      </w:r>
-    </w:p>
-    <w:p>
-      <w:pPr>
-        <w:spacing w:after="60" w:before="120"/>
-      </w:pPr>
-      <w:r>
-        <w:rPr>
-          <w:rFonts w:ascii="바탕체" w:cs="바탕체" w:eastAsia="바탕체" w:hAnsi="바탕체"/>
-          <w:b/>
-          <w:bCs/>
-          <w:sz w:val="20"/>
-          <w:szCs w:val="20"/>
-        </w:rPr>
-        <w:t xml:space="preserve">팀장님 명의 · 10.27 확정</w:t>
-      </w:r>
-    </w:p>
-    <w:p>
-      <w:pPr>
-        <w:spacing w:after="0" w:line="264"/>
-      </w:pPr>
-      <w:r>
-        <w:rPr>
-          <w:rFonts w:ascii="바탕체" w:cs="바탕체" w:eastAsia="바탕체" w:hAnsi="바탕체"/>
-          <w:sz w:val="20"/>
-          <w:szCs w:val="20"/>
-        </w:rPr>
-        <w:t xml:space="preserve">수신: DX AX/PI센터 안재용 센터장, 김상하 상무</w:t>
-      </w:r>
-    </w:p>
-    <w:p>
-      <w:pPr>
-        <w:spacing w:after="0" w:line="264"/>
-      </w:pPr>
-      <w:r>
-        <w:rPr>
-          <w:rFonts w:ascii="바탕체" w:cs="바탕체" w:eastAsia="바탕체" w:hAnsi="바탕체"/>
-          <w:sz w:val="20"/>
-          <w:szCs w:val="20"/>
-        </w:rPr>
-        <w:t xml:space="preserve">참조: AX개발팀 김경수 파트장, 이근택 프로</w:t>
-      </w:r>
-    </w:p>
-    <w:p>
-      <w:pPr>
-        <w:spacing w:after="0" w:line="264"/>
-      </w:pPr>
-      <w:r>
-        <w:rPr>
-          <w:rFonts w:ascii="바탕체" w:cs="바탕체" w:eastAsia="바탕체" w:hAnsi="바탕체"/>
-          <w:sz w:val="20"/>
-          <w:szCs w:val="20"/>
-        </w:rPr>
-        <w:t xml:space="preserve">제목: [협조 요청] AI 스크랩 하이라이트 기능 DS 적용 관련 지원 요청드립니다</w:t>
-      </w:r>
-    </w:p>
-    <w:p>
-      <w:pPr>
-        <w:spacing w:after="0" w:line="264"/>
-      </w:pPr>
-      <w:r>
-        <w:rPr>
-          <w:rFonts w:ascii="바탕체" w:cs="바탕체" w:eastAsia="바탕체" w:hAnsi="바탕체"/>
-          <w:sz w:val="20"/>
-          <w:szCs w:val="20"/>
-        </w:rPr>
-        <w:t xml:space="preserve"/>
-      </w:r>
-    </w:p>
-    <w:p>
-      <w:pPr>
-        <w:spacing w:after="0" w:line="264"/>
-      </w:pPr>
-      <w:r>
-        <w:rPr>
-          <w:rFonts w:ascii="바탕체" w:cs="바탕체" w:eastAsia="바탕체" w:hAnsi="바탕체"/>
-          <w:sz w:val="20"/>
-          <w:szCs w:val="20"/>
-        </w:rPr>
-        <w:t xml:space="preserve">안재용 센터장님, 김상하 상무님 안녕하십니까.</w:t>
-      </w:r>
-    </w:p>
-    <w:p>
-      <w:pPr>
-        <w:spacing w:after="0" w:line="264"/>
-      </w:pPr>
-      <w:r>
-        <w:rPr>
-          <w:rFonts w:ascii="바탕체" w:cs="바탕체" w:eastAsia="바탕체" w:hAnsi="바탕체"/>
-          <w:sz w:val="20"/>
-          <w:szCs w:val="20"/>
-        </w:rPr>
-        <w:t xml:space="preserve">DS 커뮤니케이션팀장 박상권입니다.</w:t>
-      </w:r>
-    </w:p>
-    <w:p>
-      <w:pPr>
-        <w:spacing w:after="0" w:line="264"/>
-      </w:pPr>
-      <w:r>
-        <w:rPr>
-          <w:rFonts w:ascii="바탕체" w:cs="바탕체" w:eastAsia="바탕체" w:hAnsi="바탕체"/>
-          <w:sz w:val="20"/>
-          <w:szCs w:val="20"/>
-        </w:rPr>
-        <w:t xml:space="preserve"/>
-      </w:r>
-    </w:p>
-    <w:p>
-      <w:pPr>
-        <w:spacing w:after="0" w:line="264"/>
-      </w:pPr>
-      <w:r>
-        <w:rPr>
-          <w:rFonts w:ascii="바탕체" w:cs="바탕체" w:eastAsia="바탕체" w:hAnsi="바탕체"/>
-          <w:sz w:val="20"/>
-          <w:szCs w:val="20"/>
-        </w:rPr>
-        <w:t xml:space="preserve">바쁘신 중에 메일로 먼저 인사드리게 되어 송구합니다.</w:t>
-      </w:r>
-    </w:p>
-    <w:p>
-      <w:pPr>
-        <w:spacing w:after="0" w:line="264"/>
-      </w:pPr>
-      <w:r>
-        <w:rPr>
-          <w:rFonts w:ascii="바탕체" w:cs="바탕체" w:eastAsia="바탕체" w:hAnsi="바탕체"/>
-          <w:sz w:val="20"/>
-          <w:szCs w:val="20"/>
-        </w:rPr>
-        <w:t xml:space="preserve">AX개발팀에서 그룹 스크랩 하이라이트 기능을 개발해 주셔서 스크랩 열람이 한결 편리해졌다는 이야기를 듣고 있습니다.</w:t>
-      </w:r>
-    </w:p>
-    <w:p>
-      <w:pPr>
-        <w:spacing w:after="0" w:line="264"/>
-      </w:pPr>
-      <w:r>
-        <w:rPr>
-          <w:rFonts w:ascii="바탕체" w:cs="바탕체" w:eastAsia="바탕체" w:hAnsi="바탕체"/>
-          <w:sz w:val="20"/>
-          <w:szCs w:val="20"/>
-        </w:rPr>
-        <w:t xml:space="preserve">DS도 해당 기능 도입을 준비하고 있으며, 이미 구축된 그룹 시스템을 활용하는 방향으로 가이드를 받았습니다.</w:t>
-      </w:r>
-    </w:p>
-    <w:p>
-      <w:pPr>
-        <w:spacing w:after="0" w:line="264"/>
-      </w:pPr>
-      <w:r>
-        <w:rPr>
-          <w:rFonts w:ascii="바탕체" w:cs="바탕체" w:eastAsia="바탕체" w:hAnsi="바탕체"/>
-          <w:sz w:val="20"/>
-          <w:szCs w:val="20"/>
-        </w:rPr>
-        <w:t xml:space="preserve">이에 기존 시스템 개발을 맡아 주신 AX개발팀에 도움을 요청드리게 되었습니다.</w:t>
-      </w:r>
-    </w:p>
-    <w:p>
-      <w:pPr>
-        <w:spacing w:after="0" w:line="264"/>
-      </w:pPr>
-      <w:r>
-        <w:rPr>
-          <w:rFonts w:ascii="바탕체" w:cs="바탕체" w:eastAsia="바탕체" w:hAnsi="바탕체"/>
-          <w:sz w:val="20"/>
-          <w:szCs w:val="20"/>
-        </w:rPr>
-        <w:t xml:space="preserve">여러 업무가 많으신 줄 알기에 요청드리는 것이 조심스러우나, 검토해 주실 수 있을지 여쭙습니다.</w:t>
-      </w:r>
-    </w:p>
-    <w:p>
-      <w:pPr>
-        <w:spacing w:after="0" w:line="264"/>
-      </w:pPr>
-      <w:r>
-        <w:rPr>
-          <w:rFonts w:ascii="바탕체" w:cs="바탕체" w:eastAsia="바탕체" w:hAnsi="바탕체"/>
-          <w:sz w:val="20"/>
-          <w:szCs w:val="20"/>
-        </w:rPr>
-        <w:t xml:space="preserve"/>
-      </w:r>
-    </w:p>
-    <w:p>
-      <w:pPr>
-        <w:spacing w:after="0" w:line="264"/>
-      </w:pPr>
-      <w:r>
-        <w:rPr>
-          <w:rFonts w:ascii="바탕체" w:cs="바탕체" w:eastAsia="바탕체" w:hAnsi="바탕체"/>
-          <w:sz w:val="20"/>
-          <w:szCs w:val="20"/>
-        </w:rPr>
-        <w:t xml:space="preserve">1. 요청드리는 사항</w:t>
-      </w:r>
-    </w:p>
-    <w:p>
-      <w:pPr>
-        <w:spacing w:after="0" w:line="264"/>
-      </w:pPr>
-      <w:r>
-        <w:rPr>
-          <w:rFonts w:ascii="바탕체" w:cs="바탕체" w:eastAsia="바탕체" w:hAnsi="바탕체"/>
-          <w:sz w:val="20"/>
-          <w:szCs w:val="20"/>
-        </w:rPr>
-        <w:t xml:space="preserve">- 기존 프로그램을 DS 스크랩에 적용할 수 있는지 검토해 주시기 바랍니다</w:t>
-      </w:r>
-    </w:p>
-    <w:p>
-      <w:pPr>
-        <w:spacing w:after="0" w:line="264"/>
-      </w:pPr>
-      <w:r>
-        <w:rPr>
-          <w:rFonts w:ascii="바탕체" w:cs="바탕체" w:eastAsia="바탕체" w:hAnsi="바탕체"/>
-          <w:sz w:val="20"/>
-          <w:szCs w:val="20"/>
-        </w:rPr>
-        <w:t xml:space="preserve">- DS 양식에 맞춘 추가 작업이 필요할 경우 개발·테스트 지원 부탁드립니다</w:t>
-      </w:r>
-    </w:p>
-    <w:p>
-      <w:pPr>
-        <w:spacing w:after="0" w:line="264"/>
-      </w:pPr>
-      <w:r>
-        <w:rPr>
-          <w:rFonts w:ascii="바탕체" w:cs="바탕체" w:eastAsia="바탕체" w:hAnsi="바탕체"/>
-          <w:sz w:val="20"/>
-          <w:szCs w:val="20"/>
-        </w:rPr>
-        <w:t xml:space="preserve"/>
-      </w:r>
-    </w:p>
-    <w:p>
-      <w:pPr>
-        <w:spacing w:after="0" w:line="264"/>
-      </w:pPr>
-      <w:r>
-        <w:rPr>
-          <w:rFonts w:ascii="바탕체" w:cs="바탕체" w:eastAsia="바탕체" w:hAnsi="바탕체"/>
-          <w:sz w:val="20"/>
-          <w:szCs w:val="20"/>
-        </w:rPr>
-        <w:t xml:space="preserve">2. DS 준비 사항</w:t>
-      </w:r>
-    </w:p>
-    <w:p>
-      <w:pPr>
-        <w:spacing w:after="0" w:line="264"/>
-      </w:pPr>
-      <w:r>
-        <w:rPr>
-          <w:rFonts w:ascii="바탕체" w:cs="바탕체" w:eastAsia="바탕체" w:hAnsi="바탕체"/>
-          <w:sz w:val="20"/>
-          <w:szCs w:val="20"/>
-        </w:rPr>
-        <w:t xml:space="preserve">- 개발팀의 부담을 최소화할 수 있도록 DS 스크랩·수기 하이라이트 샘플을 미리 준비해 전달드리겠습니다</w:t>
-      </w:r>
-    </w:p>
-    <w:p>
-      <w:pPr>
-        <w:spacing w:after="0" w:line="264"/>
-      </w:pPr>
-      <w:r>
-        <w:rPr>
-          <w:rFonts w:ascii="바탕체" w:cs="바탕체" w:eastAsia="바탕체" w:hAnsi="바탕체"/>
-          <w:sz w:val="20"/>
-          <w:szCs w:val="20"/>
-        </w:rPr>
-        <w:t xml:space="preserve">- 사용자 PC, 생성형 AI 계정, 방화벽·NASCA 등록 등 사용 환경은 DS에서 책임지고 준비하겠습니다</w:t>
-      </w:r>
-    </w:p>
-    <w:p>
-      <w:pPr>
-        <w:spacing w:after="0" w:line="264"/>
-      </w:pPr>
-      <w:r>
-        <w:rPr>
-          <w:rFonts w:ascii="바탕체" w:cs="바탕체" w:eastAsia="바탕체" w:hAnsi="바탕체"/>
-          <w:sz w:val="20"/>
-          <w:szCs w:val="20"/>
-        </w:rPr>
-        <w:t xml:space="preserve"/>
-      </w:r>
-    </w:p>
-    <w:p>
-      <w:pPr>
-        <w:spacing w:after="0" w:line="264"/>
-      </w:pPr>
-      <w:r>
-        <w:rPr>
-          <w:rFonts w:ascii="바탕체" w:cs="바탕체" w:eastAsia="바탕체" w:hAnsi="바탕체"/>
-          <w:sz w:val="20"/>
-          <w:szCs w:val="20"/>
-        </w:rPr>
-        <w:t xml:space="preserve">3. 일정</w:t>
-      </w:r>
-    </w:p>
-    <w:p>
-      <w:pPr>
-        <w:spacing w:after="0" w:line="264"/>
-      </w:pPr>
-      <w:r>
-        <w:rPr>
-          <w:rFonts w:ascii="바탕체" w:cs="바탕체" w:eastAsia="바탕체" w:hAnsi="바탕체"/>
-          <w:sz w:val="20"/>
-          <w:szCs w:val="20"/>
-        </w:rPr>
-        <w:t xml:space="preserve">- 전 계열사 공통으로 11월 테스트, 12월 적용을 목표로 하고 있어, DS도 12월 초 적용이 가능하도록 지원 부탁드립니다</w:t>
-      </w:r>
-    </w:p>
-    <w:p>
-      <w:pPr>
-        <w:spacing w:after="0" w:line="264"/>
-      </w:pPr>
-      <w:r>
-        <w:rPr>
-          <w:rFonts w:ascii="바탕체" w:cs="바탕체" w:eastAsia="바탕체" w:hAnsi="바탕체"/>
-          <w:sz w:val="20"/>
-          <w:szCs w:val="20"/>
-        </w:rPr>
-        <w:t xml:space="preserve">- 저희도 일정에 차질이 없도록 사전 준비에 최선을 다하겠습니다</w:t>
-      </w:r>
-    </w:p>
-    <w:p>
-      <w:pPr>
-        <w:spacing w:after="0" w:line="264"/>
-      </w:pPr>
-      <w:r>
-        <w:rPr>
-          <w:rFonts w:ascii="바탕체" w:cs="바탕체" w:eastAsia="바탕체" w:hAnsi="바탕체"/>
-          <w:sz w:val="20"/>
-          <w:szCs w:val="20"/>
-        </w:rPr>
-        <w:t xml:space="preserve"/>
-      </w:r>
-    </w:p>
-    <w:p>
-      <w:pPr>
-        <w:spacing w:after="0" w:line="264"/>
-      </w:pPr>
-      <w:r>
-        <w:rPr>
-          <w:rFonts w:ascii="바탕체" w:cs="바탕체" w:eastAsia="바탕체" w:hAnsi="바탕체"/>
-          <w:sz w:val="20"/>
-          <w:szCs w:val="20"/>
-        </w:rPr>
-        <w:t xml:space="preserve">바쁘신 중에 번거로운 부탁을 드려 다시 한번 송구하며,</w:t>
-      </w:r>
-    </w:p>
-    <w:p>
-      <w:pPr>
-        <w:spacing w:after="0" w:line="264"/>
-      </w:pPr>
-      <w:r>
-        <w:rPr>
-          <w:rFonts w:ascii="바탕체" w:cs="바탕체" w:eastAsia="바탕체" w:hAnsi="바탕체"/>
-          <w:sz w:val="20"/>
-          <w:szCs w:val="20"/>
-        </w:rPr>
-        <w:t xml:space="preserve">검토해 주시면 감사하겠습니다.</w:t>
-      </w:r>
-    </w:p>
-    <w:p>
-      <w:pPr>
-        <w:spacing w:after="0" w:line="264"/>
-      </w:pPr>
-      <w:r>
-        <w:rPr>
-          <w:rFonts w:ascii="바탕체" w:cs="바탕체" w:eastAsia="바탕체" w:hAnsi="바탕체"/>
-          <w:sz w:val="20"/>
-          <w:szCs w:val="20"/>
-        </w:rPr>
-        <w:t xml:space="preserve"/>
-      </w:r>
-    </w:p>
-    <w:p>
-      <w:pPr>
-        <w:spacing w:after="0" w:line="264"/>
-      </w:pPr>
-      <w:r>
-        <w:rPr>
-          <w:rFonts w:ascii="바탕체" w:cs="바탕체" w:eastAsia="바탕체" w:hAnsi="바탕체"/>
-          <w:sz w:val="20"/>
-          <w:szCs w:val="20"/>
-        </w:rPr>
-        <w:t xml:space="preserve">박상권 드림</w:t>
-      </w:r>
-    </w:p>
-    <w:p>
-      <w:pPr>
-        <w:spacing w:after="40"/>
-      </w:pPr>
-    </w:p>
-    <w:p>
-      <w:pPr>
-        <w:spacing w:after="80" w:before="240"/>
-      </w:pPr>
-      <w:r>
-        <w:rPr>
-          <w:rFonts w:ascii="바탕체" w:cs="바탕체" w:eastAsia="바탕체" w:hAnsi="바탕체"/>
-          <w:b/>
-          <w:bCs/>
-          <w:sz w:val="22"/>
-          <w:szCs w:val="22"/>
-        </w:rPr>
-        <w:t xml:space="preserve">3.3 기술 요건 (김경수 파트장 안내)</w:t>
+        <w:t xml:space="preserve">3.1 기술 요건 (김경수 파트장 안내)</w:t>
       </w:r>
     </w:p>
     <w:p>
@@ -7713,7 +6709,7 @@
           <w:sz w:val="22"/>
           <w:szCs w:val="22"/>
         </w:rPr>
-        <w:t xml:space="preserve">3.4 연락처</w:t>
+        <w:t xml:space="preserve">3.2 연락처</w:t>
       </w:r>
     </w:p>
     <w:tbl>
@@ -7935,7 +6931,7 @@
                 <w:sz w:val="19"/>
                 <w:szCs w:val="19"/>
               </w:rPr>
-              <w:t xml:space="preserve">박상권 팀장</w:t>
+              <w:t xml:space="preserve">김인철 상무/그룹장</w:t>
             </w:r>
           </w:p>
         </w:tc>
@@ -7967,7 +6963,7 @@
                 <w:sz w:val="19"/>
                 <w:szCs w:val="19"/>
               </w:rPr>
-              <w:t xml:space="preserve">DS 커뮤니케이션팀장 · 지원 요청 메일 명의</w:t>
+              <w:t xml:space="preserve">지시·팀장님 보고 · 1일 2회 보고 수신</w:t>
             </w:r>
           </w:p>
         </w:tc>
@@ -7999,7 +6995,7 @@
                 <w:sz w:val="19"/>
                 <w:szCs w:val="19"/>
               </w:rPr>
-              <w:t xml:space="preserve"/>
+              <w:t xml:space="preserve">everpfe.kim@samsung.com</w:t>
             </w:r>
           </w:p>
         </w:tc>
@@ -8068,7 +7064,7 @@
                 <w:sz w:val="19"/>
                 <w:szCs w:val="19"/>
               </w:rPr>
-              <w:t xml:space="preserve">김인철 상무/그룹장</w:t>
+              <w:t xml:space="preserve">이정섭 · 김인영 파트장</w:t>
             </w:r>
           </w:p>
         </w:tc>
@@ -8100,7 +7096,7 @@
                 <w:sz w:val="19"/>
                 <w:szCs w:val="19"/>
               </w:rPr>
-              <w:t xml:space="preserve">지시·팀장님 보고 · 1일 2회 보고 수신</w:t>
+              <w:t xml:space="preserve">진행 체크</w:t>
             </w:r>
           </w:p>
         </w:tc>
@@ -8132,7 +7128,7 @@
                 <w:sz w:val="19"/>
                 <w:szCs w:val="19"/>
               </w:rPr>
-              <w:t xml:space="preserve">everpfe.kim@samsung.com</w:t>
+              <w:t xml:space="preserve"/>
             </w:r>
           </w:p>
         </w:tc>
@@ -8201,7 +7197,7 @@
                 <w:sz w:val="19"/>
                 <w:szCs w:val="19"/>
               </w:rPr>
-              <w:t xml:space="preserve">이정섭 · 김인영 파트장</w:t>
+              <w:t xml:space="preserve">김기훈 부장</w:t>
             </w:r>
           </w:p>
         </w:tc>
@@ -8233,7 +7229,7 @@
                 <w:sz w:val="19"/>
                 <w:szCs w:val="19"/>
               </w:rPr>
-              <w:t xml:space="preserve">진행 체크</w:t>
+              <w:t xml:space="preserve">김용호 프로 측 조율 · 보고 가이드</w:t>
             </w:r>
           </w:p>
         </w:tc>
@@ -8302,7 +7298,7 @@
                 <w:sz w:val="19"/>
                 <w:szCs w:val="19"/>
               </w:rPr>
-              <w:t xml:space="preserve">DS</w:t>
+              <w:t xml:space="preserve">그룹</w:t>
             </w:r>
           </w:p>
         </w:tc>
@@ -8334,7 +7330,7 @@
                 <w:sz w:val="19"/>
                 <w:szCs w:val="19"/>
               </w:rPr>
-              <w:t xml:space="preserve">김기훈 부장</w:t>
+              <w:t xml:space="preserve">김용호 프로</w:t>
             </w:r>
           </w:p>
         </w:tc>
@@ -8366,7 +7362,7 @@
                 <w:sz w:val="19"/>
                 <w:szCs w:val="19"/>
               </w:rPr>
-              <w:t xml:space="preserve">김용호 프로 측 조율 · 보고 가이드</w:t>
+              <w:t xml:space="preserve">전자 PR기획그룹 · 그룹 사례 실무 문의</w:t>
             </w:r>
           </w:p>
         </w:tc>
@@ -8398,7 +7394,7 @@
                 <w:sz w:val="19"/>
                 <w:szCs w:val="19"/>
               </w:rPr>
-              <w:t xml:space="preserve"/>
+              <w:t xml:space="preserve">yonghoc.kim@samsung.com</w:t>
             </w:r>
           </w:p>
         </w:tc>
@@ -8435,7 +7431,7 @@
                 <w:sz w:val="19"/>
                 <w:szCs w:val="19"/>
               </w:rPr>
-              <w:t xml:space="preserve">그룹</w:t>
+              <w:t xml:space="preserve">DX</w:t>
             </w:r>
           </w:p>
         </w:tc>
@@ -8467,7 +7463,7 @@
                 <w:sz w:val="19"/>
                 <w:szCs w:val="19"/>
               </w:rPr>
-              <w:t xml:space="preserve">김용호 프로</w:t>
+              <w:t xml:space="preserve">정홍욱 상무 / 이태양 프로</w:t>
             </w:r>
           </w:p>
         </w:tc>
@@ -8499,7 +7495,7 @@
                 <w:sz w:val="19"/>
                 <w:szCs w:val="19"/>
               </w:rPr>
-              <w:t xml:space="preserve">전자 PR기획그룹 · 그룹 사례 실무 문의</w:t>
+              <w:t xml:space="preserve">국내미디어그룹 · DX 도입 책임 / 실무</w:t>
             </w:r>
           </w:p>
         </w:tc>
@@ -8531,7 +7527,7 @@
                 <w:sz w:val="19"/>
                 <w:szCs w:val="19"/>
               </w:rPr>
-              <w:t xml:space="preserve">yonghoc.kim@samsung.com</w:t>
+              <w:t xml:space="preserve">honguk.chung@samsung.com</w:t>
             </w:r>
           </w:p>
         </w:tc>
@@ -8568,7 +7564,7 @@
                 <w:sz w:val="19"/>
                 <w:szCs w:val="19"/>
               </w:rPr>
-              <w:t xml:space="preserve">DX</w:t>
+              <w:t xml:space="preserve">AX</w:t>
             </w:r>
           </w:p>
         </w:tc>
@@ -8600,7 +7596,7 @@
                 <w:sz w:val="19"/>
                 <w:szCs w:val="19"/>
               </w:rPr>
-              <w:t xml:space="preserve">정홍욱 상무 / 이태양 프로</w:t>
+              <w:t xml:space="preserve">김경수 파트장</w:t>
             </w:r>
           </w:p>
         </w:tc>
@@ -8632,7 +7628,7 @@
                 <w:sz w:val="19"/>
                 <w:szCs w:val="19"/>
               </w:rPr>
-              <w:t xml:space="preserve">국내미디어그룹 · DX 도입 책임 / 실무</w:t>
+              <w:t xml:space="preserve">전사 AX개발팀(우면동) · 기술 실무 핵심</w:t>
             </w:r>
           </w:p>
         </w:tc>
@@ -8664,7 +7660,7 @@
                 <w:sz w:val="19"/>
                 <w:szCs w:val="19"/>
               </w:rPr>
-              <w:t xml:space="preserve">honguk.chung@samsung.com</w:t>
+              <w:t xml:space="preserve">ks0326.kim@samsung.com</w:t>
             </w:r>
           </w:p>
         </w:tc>
@@ -8733,7 +7729,7 @@
                 <w:sz w:val="19"/>
                 <w:szCs w:val="19"/>
               </w:rPr>
-              <w:t xml:space="preserve">김경수 파트장</w:t>
+              <w:t xml:space="preserve">이근택 프로</w:t>
             </w:r>
           </w:p>
         </w:tc>
@@ -8765,7 +7761,7 @@
                 <w:sz w:val="19"/>
                 <w:szCs w:val="19"/>
               </w:rPr>
-              <w:t xml:space="preserve">전사 AX개발팀(우면동) · 기술 실무 핵심</w:t>
+              <w:t xml:space="preserve">전사 AX개발팀 · 개발 실무</w:t>
             </w:r>
           </w:p>
         </w:tc>
@@ -8797,7 +7793,7 @@
                 <w:sz w:val="19"/>
                 <w:szCs w:val="19"/>
               </w:rPr>
-              <w:t xml:space="preserve">ks0326.kim@samsung.com</w:t>
+              <w:t xml:space="preserve"/>
             </w:r>
           </w:p>
         </w:tc>
@@ -8866,139 +7862,6 @@
                 <w:sz w:val="19"/>
                 <w:szCs w:val="19"/>
               </w:rPr>
-              <w:t xml:space="preserve">이근택 프로</w:t>
-            </w:r>
-          </w:p>
-        </w:tc>
-        <w:tc>
-          <w:tcPr>
-            <w:tcW w:type="dxa" w:w="3626"/>
-            <w:tcBorders>
-              <w:top w:val="single" w:color="000000" w:sz="4"/>
-              <w:left w:val="single" w:color="000000" w:sz="4"/>
-              <w:bottom w:val="single" w:color="000000" w:sz="4"/>
-              <w:right w:val="single" w:color="000000" w:sz="4"/>
-            </w:tcBorders>
-            <w:tcMar>
-              <w:top w:type="dxa" w:w="30"/>
-              <w:left w:type="dxa" w:w="80"/>
-              <w:bottom w:type="dxa" w:w="30"/>
-              <w:right w:type="dxa" w:w="80"/>
-            </w:tcMar>
-          </w:tcPr>
-          <w:p>
-            <w:pPr>
-              <w:spacing w:after="0" w:line="250"/>
-            </w:pPr>
-            <w:r>
-              <w:rPr>
-                <w:rFonts w:ascii="바탕체" w:cs="바탕체" w:eastAsia="바탕체" w:hAnsi="바탕체"/>
-                <w:b w:val="false"/>
-                <w:bCs w:val="false"/>
-                <w:sz w:val="19"/>
-                <w:szCs w:val="19"/>
-              </w:rPr>
-              <w:t xml:space="preserve">전사 AX개발팀 · 개발 실무</w:t>
-            </w:r>
-          </w:p>
-        </w:tc>
-        <w:tc>
-          <w:tcPr>
-            <w:tcW w:type="dxa" w:w="2300"/>
-            <w:tcBorders>
-              <w:top w:val="single" w:color="000000" w:sz="4"/>
-              <w:left w:val="single" w:color="000000" w:sz="4"/>
-              <w:bottom w:val="single" w:color="000000" w:sz="4"/>
-              <w:right w:val="single" w:color="000000" w:sz="4"/>
-            </w:tcBorders>
-            <w:tcMar>
-              <w:top w:type="dxa" w:w="30"/>
-              <w:left w:type="dxa" w:w="80"/>
-              <w:bottom w:type="dxa" w:w="30"/>
-              <w:right w:type="dxa" w:w="80"/>
-            </w:tcMar>
-          </w:tcPr>
-          <w:p>
-            <w:pPr>
-              <w:spacing w:after="0" w:line="250"/>
-            </w:pPr>
-            <w:r>
-              <w:rPr>
-                <w:rFonts w:ascii="바탕체" w:cs="바탕체" w:eastAsia="바탕체" w:hAnsi="바탕체"/>
-                <w:b w:val="false"/>
-                <w:bCs w:val="false"/>
-                <w:sz w:val="19"/>
-                <w:szCs w:val="19"/>
-              </w:rPr>
-              <w:t xml:space="preserve"/>
-            </w:r>
-          </w:p>
-        </w:tc>
-      </w:tr>
-      <w:tr>
-        <w:trPr>
-          <w:cantSplit/>
-        </w:trPr>
-        <w:tc>
-          <w:tcPr>
-            <w:tcW w:type="dxa" w:w="700"/>
-            <w:tcBorders>
-              <w:top w:val="single" w:color="000000" w:sz="4"/>
-              <w:left w:val="single" w:color="000000" w:sz="4"/>
-              <w:bottom w:val="single" w:color="000000" w:sz="4"/>
-              <w:right w:val="single" w:color="000000" w:sz="4"/>
-            </w:tcBorders>
-            <w:tcMar>
-              <w:top w:type="dxa" w:w="30"/>
-              <w:left w:type="dxa" w:w="80"/>
-              <w:bottom w:type="dxa" w:w="30"/>
-              <w:right w:type="dxa" w:w="80"/>
-            </w:tcMar>
-          </w:tcPr>
-          <w:p>
-            <w:pPr>
-              <w:spacing w:after="0" w:line="250"/>
-            </w:pPr>
-            <w:r>
-              <w:rPr>
-                <w:rFonts w:ascii="바탕체" w:cs="바탕체" w:eastAsia="바탕체" w:hAnsi="바탕체"/>
-                <w:b w:val="false"/>
-                <w:bCs w:val="false"/>
-                <w:sz w:val="19"/>
-                <w:szCs w:val="19"/>
-              </w:rPr>
-              <w:t xml:space="preserve">AX</w:t>
-            </w:r>
-          </w:p>
-        </w:tc>
-        <w:tc>
-          <w:tcPr>
-            <w:tcW w:type="dxa" w:w="2400"/>
-            <w:tcBorders>
-              <w:top w:val="single" w:color="000000" w:sz="4"/>
-              <w:left w:val="single" w:color="000000" w:sz="4"/>
-              <w:bottom w:val="single" w:color="000000" w:sz="4"/>
-              <w:right w:val="single" w:color="000000" w:sz="4"/>
-            </w:tcBorders>
-            <w:tcMar>
-              <w:top w:type="dxa" w:w="30"/>
-              <w:left w:type="dxa" w:w="80"/>
-              <w:bottom w:type="dxa" w:w="30"/>
-              <w:right w:type="dxa" w:w="80"/>
-            </w:tcMar>
-          </w:tcPr>
-          <w:p>
-            <w:pPr>
-              <w:spacing w:after="0" w:line="250"/>
-            </w:pPr>
-            <w:r>
-              <w:rPr>
-                <w:rFonts w:ascii="바탕체" w:cs="바탕체" w:eastAsia="바탕체" w:hAnsi="바탕체"/>
-                <w:b w:val="false"/>
-                <w:bCs w:val="false"/>
-                <w:sz w:val="19"/>
-                <w:szCs w:val="19"/>
-              </w:rPr>
               <w:t xml:space="preserve">안재용 센터장 / 김상하 상무</w:t>
             </w:r>
           </w:p>
@@ -9081,7 +7944,7 @@
           <w:sz w:val="22"/>
           <w:szCs w:val="22"/>
         </w:rPr>
-        <w:t xml:space="preserve">3.5 원천 메일 요약</w:t>
+        <w:t xml:space="preserve">3.3 원천 메일 요약</w:t>
       </w:r>
     </w:p>
     <w:p>

</xml_diff>

<commit_message>
docs: rename work log second-part title
Co-Authored-By: Claude Opus 5.5 <noreply@anthropic.com>
Claude-Session: https://claude.ai/code/session_01Ev2GcePRwbwZKfH9HbtDvV
</commit_message>
<xml_diff>
--- a/docs/scrap-highlight/스크랩하이라이트_DS도입_업무일지.docx
+++ b/docs/scrap-highlight/스크랩하이라이트_DS도입_업무일지.docx
@@ -2562,7 +2562,7 @@
           <w:sz w:val="36"/>
           <w:szCs w:val="36"/>
         </w:rPr>
-        <w:t xml:space="preserve">상세</w:t>
+        <w:t xml:space="preserve">스크랩 하이라이트 DS 도입 업무일지</w:t>
       </w:r>
     </w:p>
     <w:p>
@@ -2583,7 +2583,7 @@
           <w:sz w:val="32"/>
           <w:szCs w:val="32"/>
         </w:rPr>
-        <w:t xml:space="preserve">1. 업무일지</w:t>
+        <w:t xml:space="preserve">1. 일자별 진행</w:t>
       </w:r>
     </w:p>
     <w:p>

</xml_diff>